<commit_message>
wrong last opened websites
</commit_message>
<xml_diff>
--- a/Hausarbeit_Hendrik_Stolzke_821534.docx
+++ b/Hausarbeit_Hendrik_Stolzke_821534.docx
@@ -8410,9 +8410,9 @@
           <w:szCs w:val="24"/>
         </w:rPr>
         <w:drawing>
-          <wp:inline distT="0" distB="0" distL="0" distR="0" wp14:anchorId="1228782F" wp14:editId="4A9B69B6">
-            <wp:extent cx="4103370" cy="2445648"/>
-            <wp:effectExtent l="19050" t="19050" r="11430" b="12065"/>
+          <wp:inline distT="0" distB="0" distL="0" distR="0" wp14:anchorId="1228782F" wp14:editId="5A9F6052">
+            <wp:extent cx="3919336" cy="2335962"/>
+            <wp:effectExtent l="19050" t="19050" r="24130" b="26670"/>
             <wp:docPr id="2" name="Grafik 2"/>
             <wp:cNvGraphicFramePr>
               <a:graphicFrameLocks xmlns:a="http://schemas.openxmlformats.org/drawingml/2006/main" noChangeAspect="1"/>
@@ -8433,7 +8433,7 @@
                   <pic:spPr>
                     <a:xfrm>
                       <a:off x="0" y="0"/>
-                      <a:ext cx="4108270" cy="2448568"/>
+                      <a:ext cx="3950720" cy="2354667"/>
                     </a:xfrm>
                     <a:prstGeom prst="rect">
                       <a:avLst/>
@@ -10471,7 +10471,34 @@
       </w:r>
     </w:p>
     <w:p>
-      <w:r>
+      <w:pPr>
+        <w:jc w:val="both"/>
+        <w:rPr>
+          <w:rFonts w:ascii="Arial" w:hAnsi="Arial" w:cs="Arial"/>
+          <w:sz w:val="24"/>
+          <w:szCs w:val="24"/>
+        </w:rPr>
+      </w:pPr>
+    </w:p>
+    <w:p>
+      <w:pPr>
+        <w:rPr>
+          <w:rFonts w:ascii="Arial" w:hAnsi="Arial" w:cs="Arial"/>
+          <w:b/>
+          <w:bCs/>
+          <w:sz w:val="24"/>
+          <w:szCs w:val="24"/>
+        </w:rPr>
+      </w:pPr>
+      <w:bookmarkStart w:id="30" w:name="_Toc233019763"/>
+      <w:r>
+        <w:rPr>
+          <w:rFonts w:ascii="Arial" w:hAnsi="Arial" w:cs="Arial"/>
+          <w:b/>
+          <w:bCs/>
+          <w:sz w:val="24"/>
+          <w:szCs w:val="24"/>
+        </w:rPr>
         <w:br w:type="page"/>
       </w:r>
     </w:p>
@@ -10492,7 +10519,6 @@
           <w:szCs w:val="24"/>
         </w:rPr>
       </w:pPr>
-      <w:bookmarkStart w:id="30" w:name="_Toc233019763"/>
       <w:r>
         <w:rPr>
           <w:rFonts w:ascii="Arial" w:hAnsi="Arial" w:cs="Arial"/>
@@ -10526,15 +10552,7 @@
           <w:sz w:val="24"/>
           <w:szCs w:val="24"/>
         </w:rPr>
-        <w:t>Der Einsatz von Machine Learning ermöglicht eBay vielfältige Anwendungen auf betriebswirtschaftlicher, strategischer und gesellschaftlicher Ebene. Im Folgenden werden die zentralen Effekte sowie mögliche Risiken des Einsatzes näher betrachtet</w:t>
-      </w:r>
-      <w:r>
-        <w:rPr>
-          <w:rFonts w:ascii="Arial" w:hAnsi="Arial" w:cs="Arial"/>
-          <w:sz w:val="24"/>
-          <w:szCs w:val="24"/>
-        </w:rPr>
-        <w:t>.</w:t>
+        <w:t>Der Einsatz von Machine Learning ermöglicht eBay vielfältige Anwendungen auf betriebswirtschaftlicher, strategischer und gesellschaftlicher Ebene.</w:t>
       </w:r>
     </w:p>
     <w:p>
@@ -10857,30 +10875,7 @@
         </w:rPr>
         <w:t>t.</w:t>
       </w:r>
-      <w:r>
-        <w:rPr>
-          <w:rFonts w:ascii="Arial" w:hAnsi="Arial" w:cs="Arial"/>
-          <w:sz w:val="24"/>
-          <w:szCs w:val="24"/>
-        </w:rPr>
-        <w:t xml:space="preserve"> Zudem birgt eine starke Abhängigkeit von ML</w:t>
-      </w:r>
-      <w:r>
-        <w:rPr>
-          <w:rFonts w:ascii="Arial" w:hAnsi="Arial" w:cs="Arial"/>
-          <w:sz w:val="24"/>
-          <w:szCs w:val="24"/>
-        </w:rPr>
-        <w:t>-</w:t>
-      </w:r>
-      <w:r>
-        <w:rPr>
-          <w:rFonts w:ascii="Arial" w:hAnsi="Arial" w:cs="Arial"/>
-          <w:sz w:val="24"/>
-          <w:szCs w:val="24"/>
-        </w:rPr>
-        <w:t>Preisempfehlungen das Risiko, dass Preisvielfalt und Wettbewerb auf der Plattform abnehmen.</w:t>
-      </w:r>
+      <w:bookmarkStart w:id="36" w:name="_Toc233019769"/>
     </w:p>
     <w:p>
       <w:pPr>
@@ -10895,7 +10890,6 @@
           <w:szCs w:val="24"/>
         </w:rPr>
       </w:pPr>
-      <w:bookmarkStart w:id="36" w:name="_Toc233019769"/>
       <w:r>
         <w:rPr>
           <w:rFonts w:ascii="Arial" w:hAnsi="Arial" w:cs="Arial"/>
@@ -10914,18 +10908,17 @@
       <w:pPr>
         <w:spacing w:line="240" w:lineRule="auto"/>
         <w:rPr>
-          <w:sz w:val="24"/>
-          <w:szCs w:val="24"/>
-        </w:rPr>
-      </w:pPr>
-    </w:p>
-    <w:p>
-      <w:pPr>
-        <w:shd w:val="clear" w:color="auto" w:fill="FFFFFF"/>
-        <w:spacing w:line="240" w:lineRule="auto"/>
-        <w:textAlignment w:val="baseline"/>
-        <w:rPr>
-          <w:rFonts w:ascii="Calibri" w:hAnsi="Calibri" w:cs="Calibri"/>
+          <w:rFonts w:ascii="Arial" w:hAnsi="Arial" w:cs="Arial"/>
+          <w:sz w:val="24"/>
+          <w:szCs w:val="24"/>
+        </w:rPr>
+      </w:pPr>
+    </w:p>
+    <w:p>
+      <w:pPr>
+        <w:spacing w:line="240" w:lineRule="auto"/>
+        <w:rPr>
+          <w:rFonts w:ascii="Arial" w:hAnsi="Arial" w:cs="Arial"/>
           <w:color w:val="000000"/>
           <w:sz w:val="24"/>
           <w:szCs w:val="24"/>
@@ -10933,142 +10926,515 @@
       </w:pPr>
       <w:r>
         <w:rPr>
-          <w:rFonts w:ascii="Calibri" w:hAnsi="Calibri" w:cs="Calibri"/>
+          <w:rFonts w:ascii="Arial" w:hAnsi="Arial" w:cs="Arial"/>
           <w:color w:val="000000"/>
           <w:sz w:val="24"/>
           <w:szCs w:val="24"/>
         </w:rPr>
-        <w:t xml:space="preserve">Allgemeine Informationen zu eBay </w:t>
-      </w:r>
-    </w:p>
-    <w:p>
-      <w:pPr>
-        <w:shd w:val="clear" w:color="auto" w:fill="FFFFFF"/>
-        <w:spacing w:line="240" w:lineRule="auto"/>
-        <w:textAlignment w:val="baseline"/>
-      </w:pPr>
-      <w:r>
-        <w:t xml:space="preserve">[1] </w:t>
+        <w:t>[1] eBay Inc., „eBay feiert Geburtstag… 25 Jahre als Marktplatz“</w:t>
+      </w:r>
+      <w:r>
+        <w:rPr>
+          <w:rFonts w:ascii="Arial" w:hAnsi="Arial" w:cs="Arial"/>
+          <w:color w:val="000000"/>
+          <w:sz w:val="24"/>
+          <w:szCs w:val="24"/>
+        </w:rPr>
+        <w:t>,</w:t>
+      </w:r>
+      <w:r>
+        <w:rPr>
+          <w:rFonts w:ascii="Arial" w:hAnsi="Arial" w:cs="Arial"/>
+          <w:color w:val="000000"/>
+          <w:sz w:val="24"/>
+          <w:szCs w:val="24"/>
+        </w:rPr>
+        <w:t xml:space="preserve"> </w:t>
       </w:r>
       <w:hyperlink r:id="rId18" w:history="1">
         <w:r>
           <w:rPr>
             <w:rStyle w:val="Hyperlink"/>
+            <w:rFonts w:ascii="Arial" w:hAnsi="Arial" w:cs="Arial"/>
+            <w:sz w:val="24"/>
+            <w:szCs w:val="24"/>
           </w:rPr>
           <w:t>https://www.ebayinc.com/stories/press-room/de/ebay-feiert-geburtstag-seit-25-jahren-als-partnerschaftlicher-marktplatz-erfolgreich-und-heute-so-relevant-wie-nie/</w:t>
         </w:r>
       </w:hyperlink>
-    </w:p>
-    <w:p>
-      <w:pPr>
-        <w:shd w:val="clear" w:color="auto" w:fill="FFFFFF"/>
-        <w:spacing w:line="240" w:lineRule="auto"/>
-        <w:textAlignment w:val="baseline"/>
-      </w:pPr>
-      <w:r>
-        <w:t xml:space="preserve">[2] </w:t>
+      <w:r>
+        <w:rPr>
+          <w:rFonts w:ascii="Arial" w:hAnsi="Arial" w:cs="Arial"/>
+          <w:color w:val="000000"/>
+          <w:sz w:val="24"/>
+          <w:szCs w:val="24"/>
+        </w:rPr>
+        <w:t xml:space="preserve"> </w:t>
+      </w:r>
+      <w:r>
+        <w:rPr>
+          <w:rFonts w:ascii="Arial" w:hAnsi="Arial" w:cs="Arial"/>
+          <w:sz w:val="24"/>
+          <w:szCs w:val="24"/>
+        </w:rPr>
+        <w:t xml:space="preserve">(abgerufen am </w:t>
+      </w:r>
+      <w:r>
+        <w:rPr>
+          <w:rFonts w:ascii="Arial" w:hAnsi="Arial" w:cs="Arial"/>
+          <w:sz w:val="24"/>
+          <w:szCs w:val="24"/>
+        </w:rPr>
+        <w:t>9</w:t>
+      </w:r>
+      <w:r>
+        <w:rPr>
+          <w:rFonts w:ascii="Arial" w:hAnsi="Arial" w:cs="Arial"/>
+          <w:sz w:val="24"/>
+          <w:szCs w:val="24"/>
+        </w:rPr>
+        <w:t xml:space="preserve">. </w:t>
+      </w:r>
+      <w:r>
+        <w:rPr>
+          <w:rFonts w:ascii="Arial" w:hAnsi="Arial" w:cs="Arial"/>
+          <w:sz w:val="24"/>
+          <w:szCs w:val="24"/>
+        </w:rPr>
+        <w:t>Mai</w:t>
+      </w:r>
+      <w:r>
+        <w:rPr>
+          <w:rFonts w:ascii="Arial" w:hAnsi="Arial" w:cs="Arial"/>
+          <w:sz w:val="24"/>
+          <w:szCs w:val="24"/>
+        </w:rPr>
+        <w:t xml:space="preserve"> 2026)</w:t>
+      </w:r>
+    </w:p>
+    <w:p>
+      <w:pPr>
+        <w:spacing w:line="240" w:lineRule="auto"/>
+        <w:rPr>
+          <w:rFonts w:ascii="Arial" w:hAnsi="Arial" w:cs="Arial"/>
+          <w:color w:val="000000"/>
+          <w:sz w:val="24"/>
+          <w:szCs w:val="24"/>
+        </w:rPr>
+      </w:pPr>
+      <w:r>
+        <w:rPr>
+          <w:rFonts w:ascii="Arial" w:hAnsi="Arial" w:cs="Arial"/>
+          <w:color w:val="000000"/>
+          <w:sz w:val="24"/>
+          <w:szCs w:val="24"/>
+        </w:rPr>
+        <w:t>[2] WDR, „Stichtag: eBay“</w:t>
+      </w:r>
+      <w:r>
+        <w:rPr>
+          <w:rFonts w:ascii="Arial" w:hAnsi="Arial" w:cs="Arial"/>
+          <w:color w:val="000000"/>
+          <w:sz w:val="24"/>
+          <w:szCs w:val="24"/>
+        </w:rPr>
+        <w:t>,</w:t>
+      </w:r>
+      <w:r>
+        <w:rPr>
+          <w:rFonts w:ascii="Arial" w:hAnsi="Arial" w:cs="Arial"/>
+          <w:color w:val="000000"/>
+          <w:sz w:val="24"/>
+          <w:szCs w:val="24"/>
+        </w:rPr>
+        <w:t xml:space="preserve"> </w:t>
       </w:r>
       <w:hyperlink r:id="rId19" w:history="1">
         <w:r>
           <w:rPr>
             <w:rStyle w:val="Hyperlink"/>
+            <w:rFonts w:ascii="Arial" w:hAnsi="Arial" w:cs="Arial"/>
+            <w:sz w:val="24"/>
+            <w:szCs w:val="24"/>
           </w:rPr>
           <w:t>https://www1.wdr.de/stichtag/stichtag9046.html</w:t>
         </w:r>
       </w:hyperlink>
-    </w:p>
-    <w:p>
-      <w:pPr>
-        <w:shd w:val="clear" w:color="auto" w:fill="FFFFFF"/>
-        <w:spacing w:line="240" w:lineRule="auto"/>
-        <w:textAlignment w:val="baseline"/>
-      </w:pPr>
-      <w:r>
-        <w:t xml:space="preserve">[3] </w:t>
+      <w:r>
+        <w:rPr>
+          <w:rFonts w:ascii="Arial" w:hAnsi="Arial" w:cs="Arial"/>
+          <w:color w:val="000000"/>
+          <w:sz w:val="24"/>
+          <w:szCs w:val="24"/>
+        </w:rPr>
+        <w:t xml:space="preserve"> </w:t>
+      </w:r>
+      <w:r>
+        <w:rPr>
+          <w:rFonts w:ascii="Arial" w:hAnsi="Arial" w:cs="Arial"/>
+          <w:sz w:val="24"/>
+          <w:szCs w:val="24"/>
+        </w:rPr>
+        <w:t xml:space="preserve">(abgerufen am </w:t>
+      </w:r>
+      <w:r>
+        <w:rPr>
+          <w:rFonts w:ascii="Arial" w:hAnsi="Arial" w:cs="Arial"/>
+          <w:sz w:val="24"/>
+          <w:szCs w:val="24"/>
+        </w:rPr>
+        <w:t>20</w:t>
+      </w:r>
+      <w:r>
+        <w:rPr>
+          <w:rFonts w:ascii="Arial" w:hAnsi="Arial" w:cs="Arial"/>
+          <w:sz w:val="24"/>
+          <w:szCs w:val="24"/>
+        </w:rPr>
+        <w:t xml:space="preserve">. </w:t>
+      </w:r>
+      <w:r>
+        <w:rPr>
+          <w:rFonts w:ascii="Arial" w:hAnsi="Arial" w:cs="Arial"/>
+          <w:sz w:val="24"/>
+          <w:szCs w:val="24"/>
+        </w:rPr>
+        <w:t>Mai</w:t>
+      </w:r>
+      <w:r>
+        <w:rPr>
+          <w:rFonts w:ascii="Arial" w:hAnsi="Arial" w:cs="Arial"/>
+          <w:sz w:val="24"/>
+          <w:szCs w:val="24"/>
+        </w:rPr>
+        <w:t xml:space="preserve"> 2026)</w:t>
+      </w:r>
+    </w:p>
+    <w:p>
+      <w:pPr>
+        <w:spacing w:line="240" w:lineRule="auto"/>
+        <w:rPr>
+          <w:rFonts w:ascii="Arial" w:hAnsi="Arial" w:cs="Arial"/>
+          <w:color w:val="000000"/>
+          <w:sz w:val="24"/>
+          <w:szCs w:val="24"/>
+        </w:rPr>
+      </w:pPr>
+      <w:r>
+        <w:rPr>
+          <w:rFonts w:ascii="Arial" w:hAnsi="Arial" w:cs="Arial"/>
+          <w:color w:val="000000"/>
+          <w:sz w:val="24"/>
+          <w:szCs w:val="24"/>
+        </w:rPr>
+        <w:t>[3] Wikipedia, „eBay“</w:t>
+      </w:r>
+      <w:r>
+        <w:rPr>
+          <w:rFonts w:ascii="Arial" w:hAnsi="Arial" w:cs="Arial"/>
+          <w:color w:val="000000"/>
+          <w:sz w:val="24"/>
+          <w:szCs w:val="24"/>
+        </w:rPr>
+        <w:t>,</w:t>
+      </w:r>
+      <w:r>
+        <w:rPr>
+          <w:rFonts w:ascii="Arial" w:hAnsi="Arial" w:cs="Arial"/>
+          <w:color w:val="000000"/>
+          <w:sz w:val="24"/>
+          <w:szCs w:val="24"/>
+        </w:rPr>
+        <w:t xml:space="preserve"> </w:t>
       </w:r>
       <w:hyperlink r:id="rId20" w:history="1">
         <w:r>
           <w:rPr>
             <w:rStyle w:val="Hyperlink"/>
+            <w:rFonts w:ascii="Arial" w:hAnsi="Arial" w:cs="Arial"/>
+            <w:sz w:val="24"/>
+            <w:szCs w:val="24"/>
           </w:rPr>
           <w:t>https://de.wikipedia.org/wiki/EBay</w:t>
         </w:r>
       </w:hyperlink>
-    </w:p>
-    <w:p>
-      <w:pPr>
-        <w:shd w:val="clear" w:color="auto" w:fill="FFFFFF"/>
-        <w:spacing w:line="240" w:lineRule="auto"/>
-        <w:textAlignment w:val="baseline"/>
-      </w:pPr>
-      <w:r>
-        <w:t xml:space="preserve">[4] </w:t>
+      <w:r>
+        <w:rPr>
+          <w:rFonts w:ascii="Arial" w:hAnsi="Arial" w:cs="Arial"/>
+          <w:color w:val="000000"/>
+          <w:sz w:val="24"/>
+          <w:szCs w:val="24"/>
+        </w:rPr>
+        <w:t xml:space="preserve"> </w:t>
+      </w:r>
+      <w:r>
+        <w:rPr>
+          <w:rFonts w:ascii="Arial" w:hAnsi="Arial" w:cs="Arial"/>
+          <w:sz w:val="24"/>
+          <w:szCs w:val="24"/>
+        </w:rPr>
+        <w:t>(abgerufen am 2</w:t>
+      </w:r>
+      <w:r>
+        <w:rPr>
+          <w:rFonts w:ascii="Arial" w:hAnsi="Arial" w:cs="Arial"/>
+          <w:sz w:val="24"/>
+          <w:szCs w:val="24"/>
+        </w:rPr>
+        <w:t>0</w:t>
+      </w:r>
+      <w:r>
+        <w:rPr>
+          <w:rFonts w:ascii="Arial" w:hAnsi="Arial" w:cs="Arial"/>
+          <w:sz w:val="24"/>
+          <w:szCs w:val="24"/>
+        </w:rPr>
+        <w:t xml:space="preserve">. </w:t>
+      </w:r>
+      <w:r>
+        <w:rPr>
+          <w:rFonts w:ascii="Arial" w:hAnsi="Arial" w:cs="Arial"/>
+          <w:sz w:val="24"/>
+          <w:szCs w:val="24"/>
+        </w:rPr>
+        <w:t>Mai</w:t>
+      </w:r>
+      <w:r>
+        <w:rPr>
+          <w:rFonts w:ascii="Arial" w:hAnsi="Arial" w:cs="Arial"/>
+          <w:sz w:val="24"/>
+          <w:szCs w:val="24"/>
+        </w:rPr>
+        <w:t xml:space="preserve"> 2026)</w:t>
+      </w:r>
+    </w:p>
+    <w:p>
+      <w:pPr>
+        <w:spacing w:line="240" w:lineRule="auto"/>
+        <w:rPr>
+          <w:rFonts w:ascii="Arial" w:hAnsi="Arial" w:cs="Arial"/>
+          <w:color w:val="000000"/>
+          <w:sz w:val="24"/>
+          <w:szCs w:val="24"/>
+        </w:rPr>
+      </w:pPr>
+      <w:r>
+        <w:rPr>
+          <w:rFonts w:ascii="Arial" w:hAnsi="Arial" w:cs="Arial"/>
+          <w:color w:val="000000"/>
+          <w:sz w:val="24"/>
+          <w:szCs w:val="24"/>
+        </w:rPr>
+        <w:t>[4] eBay Hilfe, „Artikel über Auktionen verkaufen“</w:t>
+      </w:r>
+      <w:r>
+        <w:rPr>
+          <w:rFonts w:ascii="Arial" w:hAnsi="Arial" w:cs="Arial"/>
+          <w:color w:val="000000"/>
+          <w:sz w:val="24"/>
+          <w:szCs w:val="24"/>
+        </w:rPr>
+        <w:t>,</w:t>
+      </w:r>
+      <w:r>
+        <w:rPr>
+          <w:rFonts w:ascii="Arial" w:hAnsi="Arial" w:cs="Arial"/>
+          <w:color w:val="000000"/>
+          <w:sz w:val="24"/>
+          <w:szCs w:val="24"/>
+        </w:rPr>
+        <w:t xml:space="preserve"> </w:t>
       </w:r>
       <w:hyperlink r:id="rId21" w:history="1">
         <w:r>
           <w:rPr>
             <w:rStyle w:val="Hyperlink"/>
+            <w:rFonts w:ascii="Arial" w:hAnsi="Arial" w:cs="Arial"/>
+            <w:sz w:val="24"/>
+            <w:szCs w:val="24"/>
           </w:rPr>
-          <w:t>https://www.ebay.de/help/selling/listings/artikel-ber-auktionen-verkaufen?id=4110&amp;srsltid=AfmBOoqTz6qAdtYotVFaQiV-gJNDzZJXp9YcqK74htqbhiNR8RpD0USV</w:t>
+          <w:t>https://www.ebay.de/help/selling/listings/artikel-ber-auktionen-verkaufen?id=4110</w:t>
         </w:r>
       </w:hyperlink>
-    </w:p>
-    <w:p>
-      <w:pPr>
-        <w:shd w:val="clear" w:color="auto" w:fill="FFFFFF"/>
-        <w:spacing w:line="240" w:lineRule="auto"/>
-        <w:textAlignment w:val="baseline"/>
-      </w:pPr>
-      <w:r>
-        <w:t xml:space="preserve">[5] </w:t>
+      <w:r>
+        <w:rPr>
+          <w:rFonts w:ascii="Arial" w:hAnsi="Arial" w:cs="Arial"/>
+          <w:color w:val="000000"/>
+          <w:sz w:val="24"/>
+          <w:szCs w:val="24"/>
+        </w:rPr>
+        <w:t xml:space="preserve"> </w:t>
+      </w:r>
+      <w:r>
+        <w:rPr>
+          <w:rFonts w:ascii="Arial" w:hAnsi="Arial" w:cs="Arial"/>
+          <w:sz w:val="24"/>
+          <w:szCs w:val="24"/>
+        </w:rPr>
+        <w:t xml:space="preserve">(abgerufen am </w:t>
+      </w:r>
+      <w:r>
+        <w:rPr>
+          <w:rFonts w:ascii="Arial" w:hAnsi="Arial" w:cs="Arial"/>
+          <w:sz w:val="24"/>
+          <w:szCs w:val="24"/>
+        </w:rPr>
+        <w:t>1</w:t>
+      </w:r>
+      <w:r>
+        <w:rPr>
+          <w:rFonts w:ascii="Arial" w:hAnsi="Arial" w:cs="Arial"/>
+          <w:sz w:val="24"/>
+          <w:szCs w:val="24"/>
+        </w:rPr>
+        <w:t>3</w:t>
+      </w:r>
+      <w:r>
+        <w:rPr>
+          <w:rFonts w:ascii="Arial" w:hAnsi="Arial" w:cs="Arial"/>
+          <w:sz w:val="24"/>
+          <w:szCs w:val="24"/>
+        </w:rPr>
+        <w:t>. Juni 2026)</w:t>
+      </w:r>
+    </w:p>
+    <w:p>
+      <w:pPr>
+        <w:spacing w:line="240" w:lineRule="auto"/>
+        <w:rPr>
+          <w:rFonts w:ascii="Arial" w:hAnsi="Arial" w:cs="Arial"/>
+          <w:color w:val="000000"/>
+          <w:sz w:val="24"/>
+          <w:szCs w:val="24"/>
+        </w:rPr>
+      </w:pPr>
+      <w:r>
+        <w:rPr>
+          <w:rFonts w:ascii="Arial" w:hAnsi="Arial" w:cs="Arial"/>
+          <w:color w:val="000000"/>
+          <w:sz w:val="24"/>
+          <w:szCs w:val="24"/>
+        </w:rPr>
+        <w:t>[5] eBay Inc., „eBay completes sale of StubHub“</w:t>
+      </w:r>
+      <w:r>
+        <w:rPr>
+          <w:rFonts w:ascii="Arial" w:hAnsi="Arial" w:cs="Arial"/>
+          <w:color w:val="000000"/>
+          <w:sz w:val="24"/>
+          <w:szCs w:val="24"/>
+        </w:rPr>
+        <w:t>,</w:t>
+      </w:r>
+      <w:r>
+        <w:rPr>
+          <w:rFonts w:ascii="Arial" w:hAnsi="Arial" w:cs="Arial"/>
+          <w:color w:val="000000"/>
+          <w:sz w:val="24"/>
+          <w:szCs w:val="24"/>
+        </w:rPr>
+        <w:t xml:space="preserve"> </w:t>
       </w:r>
       <w:hyperlink r:id="rId22" w:history="1">
         <w:r>
           <w:rPr>
             <w:rStyle w:val="Hyperlink"/>
+            <w:rFonts w:ascii="Arial" w:hAnsi="Arial" w:cs="Arial"/>
+            <w:sz w:val="24"/>
+            <w:szCs w:val="24"/>
           </w:rPr>
           <w:t>https://www.ebayinc.com/stories/news/ebay-completes-sale-of-stubhub/</w:t>
         </w:r>
       </w:hyperlink>
-    </w:p>
-    <w:p>
-      <w:pPr>
-        <w:shd w:val="clear" w:color="auto" w:fill="FFFFFF"/>
-        <w:spacing w:line="240" w:lineRule="auto"/>
-        <w:textAlignment w:val="baseline"/>
-      </w:pPr>
-      <w:r>
-        <w:t xml:space="preserve">[6] </w:t>
+      <w:r>
+        <w:rPr>
+          <w:rFonts w:ascii="Arial" w:hAnsi="Arial" w:cs="Arial"/>
+          <w:color w:val="000000"/>
+          <w:sz w:val="24"/>
+          <w:szCs w:val="24"/>
+        </w:rPr>
+        <w:t xml:space="preserve"> </w:t>
+      </w:r>
+      <w:r>
+        <w:rPr>
+          <w:rFonts w:ascii="Arial" w:hAnsi="Arial" w:cs="Arial"/>
+          <w:sz w:val="24"/>
+          <w:szCs w:val="24"/>
+        </w:rPr>
+        <w:t>(abgerufen am 22. Juni 2026)</w:t>
+      </w:r>
+    </w:p>
+    <w:p>
+      <w:pPr>
+        <w:spacing w:line="240" w:lineRule="auto"/>
+        <w:rPr>
+          <w:rFonts w:ascii="Arial" w:hAnsi="Arial" w:cs="Arial"/>
+          <w:color w:val="000000"/>
+          <w:sz w:val="24"/>
+          <w:szCs w:val="24"/>
+        </w:rPr>
+      </w:pPr>
+      <w:r>
+        <w:rPr>
+          <w:rFonts w:ascii="Arial" w:hAnsi="Arial" w:cs="Arial"/>
+          <w:color w:val="000000"/>
+          <w:sz w:val="24"/>
+          <w:szCs w:val="24"/>
+        </w:rPr>
+        <w:t>[6] eBay Account Settings, „AI Preferences“</w:t>
+      </w:r>
+      <w:r>
+        <w:rPr>
+          <w:rFonts w:ascii="Arial" w:hAnsi="Arial" w:cs="Arial"/>
+          <w:color w:val="000000"/>
+          <w:sz w:val="24"/>
+          <w:szCs w:val="24"/>
+        </w:rPr>
+        <w:t>,</w:t>
+      </w:r>
+      <w:r>
+        <w:rPr>
+          <w:rFonts w:ascii="Arial" w:hAnsi="Arial" w:cs="Arial"/>
+          <w:color w:val="000000"/>
+          <w:sz w:val="24"/>
+          <w:szCs w:val="24"/>
+        </w:rPr>
+        <w:t xml:space="preserve"> </w:t>
       </w:r>
       <w:hyperlink r:id="rId23" w:history="1">
         <w:r>
           <w:rPr>
             <w:rStyle w:val="Hyperlink"/>
+            <w:rFonts w:ascii="Arial" w:hAnsi="Arial" w:cs="Arial"/>
+            <w:sz w:val="24"/>
+            <w:szCs w:val="24"/>
           </w:rPr>
           <w:t>https://accountsettings.ebay.de/ai-preferences</w:t>
         </w:r>
       </w:hyperlink>
-    </w:p>
-    <w:p>
-      <w:pPr>
-        <w:shd w:val="clear" w:color="auto" w:fill="FFFFFF"/>
-        <w:spacing w:line="240" w:lineRule="auto"/>
-        <w:textAlignment w:val="baseline"/>
-        <w:rPr>
-          <w:rFonts w:ascii="Calibri" w:hAnsi="Calibri" w:cs="Calibri"/>
+      <w:r>
+        <w:rPr>
+          <w:rFonts w:ascii="Arial" w:hAnsi="Arial" w:cs="Arial"/>
           <w:color w:val="000000"/>
           <w:sz w:val="24"/>
           <w:szCs w:val="24"/>
         </w:rPr>
-      </w:pPr>
-    </w:p>
-    <w:p>
-      <w:pPr>
-        <w:shd w:val="clear" w:color="auto" w:fill="FFFFFF"/>
-        <w:spacing w:line="240" w:lineRule="auto"/>
-        <w:textAlignment w:val="baseline"/>
-        <w:rPr>
-          <w:rFonts w:ascii="Calibri" w:hAnsi="Calibri" w:cs="Calibri"/>
+        <w:t xml:space="preserve"> </w:t>
+      </w:r>
+      <w:r>
+        <w:rPr>
+          <w:rFonts w:ascii="Arial" w:hAnsi="Arial" w:cs="Arial"/>
+          <w:sz w:val="24"/>
+          <w:szCs w:val="24"/>
+        </w:rPr>
+        <w:t>(abgerufen am 22. Juni 2026)</w:t>
+      </w:r>
+    </w:p>
+    <w:p>
+      <w:pPr>
+        <w:spacing w:line="240" w:lineRule="auto"/>
+        <w:rPr>
+          <w:rFonts w:ascii="Arial" w:hAnsi="Arial" w:cs="Arial"/>
           <w:color w:val="000000"/>
           <w:sz w:val="24"/>
           <w:szCs w:val="24"/>
@@ -11076,35 +11442,28 @@
       </w:pPr>
       <w:r>
         <w:rPr>
-          <w:rFonts w:ascii="Calibri" w:hAnsi="Calibri" w:cs="Calibri"/>
+          <w:rFonts w:ascii="Arial" w:hAnsi="Arial" w:cs="Arial"/>
           <w:color w:val="000000"/>
           <w:sz w:val="24"/>
           <w:szCs w:val="24"/>
         </w:rPr>
-        <w:t>Datengrundlage</w:t>
-      </w:r>
-    </w:p>
-    <w:p>
-      <w:pPr>
-        <w:shd w:val="clear" w:color="auto" w:fill="FFFFFF"/>
-        <w:spacing w:line="240" w:lineRule="auto"/>
-        <w:textAlignment w:val="baseline"/>
-        <w:rPr>
-          <w:rFonts w:ascii="Calibri" w:hAnsi="Calibri" w:cs="Calibri"/>
+        <w:t>[7] Modeling Online Auctions, „Datasets“</w:t>
+      </w:r>
+      <w:r>
+        <w:rPr>
+          <w:rFonts w:ascii="Arial" w:hAnsi="Arial" w:cs="Arial"/>
           <w:color w:val="000000"/>
-        </w:rPr>
-      </w:pPr>
-      <w:r>
-        <w:rPr>
-          <w:rFonts w:ascii="Calibri" w:hAnsi="Calibri" w:cs="Calibri"/>
+          <w:sz w:val="24"/>
+          <w:szCs w:val="24"/>
+        </w:rPr>
+        <w:t>,</w:t>
+      </w:r>
+      <w:r>
+        <w:rPr>
+          <w:rFonts w:ascii="Arial" w:hAnsi="Arial" w:cs="Arial"/>
           <w:color w:val="000000"/>
-        </w:rPr>
-        <w:t>[7]</w:t>
-      </w:r>
-      <w:r>
-        <w:rPr>
-          <w:rFonts w:ascii="Calibri" w:hAnsi="Calibri" w:cs="Calibri"/>
-          <w:color w:val="000000"/>
+          <w:sz w:val="24"/>
+          <w:szCs w:val="24"/>
         </w:rPr>
         <w:t xml:space="preserve"> </w:t>
       </w:r>
@@ -11112,52 +11471,159 @@
         <w:r>
           <w:rPr>
             <w:rStyle w:val="Hyperlink"/>
-            <w:rFonts w:ascii="Calibri" w:hAnsi="Calibri" w:cs="Calibri"/>
-            <w:bdr w:val="none" w:sz="0" w:space="0" w:color="auto" w:frame="1"/>
+            <w:rFonts w:ascii="Arial" w:hAnsi="Arial" w:cs="Arial"/>
+            <w:sz w:val="24"/>
+            <w:szCs w:val="24"/>
           </w:rPr>
           <w:t>https://www.modelingonlineauctions.com/datasets</w:t>
         </w:r>
       </w:hyperlink>
-    </w:p>
-    <w:p>
-      <w:pPr>
-        <w:shd w:val="clear" w:color="auto" w:fill="FFFFFF"/>
-        <w:spacing w:line="240" w:lineRule="auto"/>
-        <w:textAlignment w:val="baseline"/>
-        <w:rPr>
-          <w:rFonts w:ascii="Calibri" w:hAnsi="Calibri" w:cs="Calibri"/>
+      <w:r>
+        <w:rPr>
+          <w:rFonts w:ascii="Arial" w:hAnsi="Arial" w:cs="Arial"/>
           <w:color w:val="000000"/>
-        </w:rPr>
-      </w:pPr>
-      <w:r>
-        <w:rPr>
-          <w:rFonts w:ascii="Calibri" w:hAnsi="Calibri" w:cs="Calibri"/>
+          <w:sz w:val="24"/>
+          <w:szCs w:val="24"/>
+        </w:rPr>
+        <w:t xml:space="preserve"> </w:t>
+      </w:r>
+      <w:r>
+        <w:rPr>
+          <w:rFonts w:ascii="Arial" w:hAnsi="Arial" w:cs="Arial"/>
+          <w:sz w:val="24"/>
+          <w:szCs w:val="24"/>
+        </w:rPr>
+        <w:t>(abgerufen am</w:t>
+      </w:r>
+      <w:r>
+        <w:rPr>
+          <w:rFonts w:ascii="Arial" w:hAnsi="Arial" w:cs="Arial"/>
+          <w:sz w:val="24"/>
+          <w:szCs w:val="24"/>
+        </w:rPr>
+        <w:t xml:space="preserve"> 30</w:t>
+      </w:r>
+      <w:r>
+        <w:rPr>
+          <w:rFonts w:ascii="Arial" w:hAnsi="Arial" w:cs="Arial"/>
+          <w:sz w:val="24"/>
+          <w:szCs w:val="24"/>
+        </w:rPr>
+        <w:t xml:space="preserve">. </w:t>
+      </w:r>
+      <w:r>
+        <w:rPr>
+          <w:rFonts w:ascii="Arial" w:hAnsi="Arial" w:cs="Arial"/>
+          <w:sz w:val="24"/>
+          <w:szCs w:val="24"/>
+        </w:rPr>
+        <w:t>April</w:t>
+      </w:r>
+      <w:r>
+        <w:rPr>
+          <w:rFonts w:ascii="Arial" w:hAnsi="Arial" w:cs="Arial"/>
+          <w:sz w:val="24"/>
+          <w:szCs w:val="24"/>
+        </w:rPr>
+        <w:t xml:space="preserve"> 2026)</w:t>
+      </w:r>
+    </w:p>
+    <w:p>
+      <w:pPr>
+        <w:spacing w:line="240" w:lineRule="auto"/>
+        <w:rPr>
+          <w:rFonts w:ascii="Arial" w:hAnsi="Arial" w:cs="Arial"/>
+          <w:sz w:val="24"/>
+          <w:szCs w:val="24"/>
+        </w:rPr>
+      </w:pPr>
+      <w:r>
+        <w:rPr>
+          <w:rFonts w:ascii="Arial" w:hAnsi="Arial" w:cs="Arial"/>
           <w:color w:val="000000"/>
-        </w:rPr>
-        <w:t>[8]</w:t>
-      </w:r>
-      <w:r>
-        <w:rPr>
-          <w:rFonts w:ascii="Calibri" w:hAnsi="Calibri" w:cs="Calibri"/>
+          <w:sz w:val="24"/>
+          <w:szCs w:val="24"/>
+        </w:rPr>
+        <w:t>[8] GitHub Awesome Data, „Awesome Public Datasets“</w:t>
+      </w:r>
+      <w:r>
+        <w:rPr>
+          <w:rFonts w:ascii="Arial" w:hAnsi="Arial" w:cs="Arial"/>
           <w:color w:val="000000"/>
+          <w:sz w:val="24"/>
+          <w:szCs w:val="24"/>
+        </w:rPr>
+        <w:t>,</w:t>
+      </w:r>
+      <w:r>
+        <w:rPr>
+          <w:rFonts w:ascii="Arial" w:hAnsi="Arial" w:cs="Arial"/>
+          <w:color w:val="000000"/>
+          <w:sz w:val="24"/>
+          <w:szCs w:val="24"/>
         </w:rPr>
         <w:t xml:space="preserve"> </w:t>
       </w:r>
-      <w:hyperlink r:id="rId25" w:tooltip="https://github.com/awesomedata/awesome-public-datasets" w:history="1">
+      <w:hyperlink r:id="rId25" w:history="1">
         <w:r>
           <w:rPr>
             <w:rStyle w:val="Hyperlink"/>
-            <w:rFonts w:ascii="Calibri" w:hAnsi="Calibri" w:cs="Calibri"/>
-            <w:bdr w:val="none" w:sz="0" w:space="0" w:color="auto" w:frame="1"/>
+            <w:rFonts w:ascii="Arial" w:hAnsi="Arial" w:cs="Arial"/>
+            <w:sz w:val="24"/>
+            <w:szCs w:val="24"/>
           </w:rPr>
           <w:t>https://github.com/awesomedata/awesome-public-datasets</w:t>
         </w:r>
       </w:hyperlink>
-    </w:p>
-    <w:p>
-      <w:pPr>
-        <w:spacing w:line="240" w:lineRule="auto"/>
-      </w:pPr>
+      <w:r>
+        <w:rPr>
+          <w:rFonts w:ascii="Arial" w:hAnsi="Arial" w:cs="Arial"/>
+          <w:color w:val="000000"/>
+          <w:sz w:val="24"/>
+          <w:szCs w:val="24"/>
+        </w:rPr>
+        <w:t xml:space="preserve"> </w:t>
+      </w:r>
+      <w:r>
+        <w:rPr>
+          <w:rFonts w:ascii="Arial" w:hAnsi="Arial" w:cs="Arial"/>
+          <w:sz w:val="24"/>
+          <w:szCs w:val="24"/>
+        </w:rPr>
+        <w:t xml:space="preserve">(abgerufen am </w:t>
+      </w:r>
+      <w:r>
+        <w:rPr>
+          <w:rFonts w:ascii="Arial" w:hAnsi="Arial" w:cs="Arial"/>
+          <w:sz w:val="24"/>
+          <w:szCs w:val="24"/>
+        </w:rPr>
+        <w:t>30</w:t>
+      </w:r>
+      <w:r>
+        <w:rPr>
+          <w:rFonts w:ascii="Arial" w:hAnsi="Arial" w:cs="Arial"/>
+          <w:sz w:val="24"/>
+          <w:szCs w:val="24"/>
+        </w:rPr>
+        <w:t xml:space="preserve">. </w:t>
+      </w:r>
+      <w:r>
+        <w:rPr>
+          <w:rFonts w:ascii="Arial" w:hAnsi="Arial" w:cs="Arial"/>
+          <w:sz w:val="24"/>
+          <w:szCs w:val="24"/>
+        </w:rPr>
+        <w:t>April</w:t>
+      </w:r>
+      <w:r>
+        <w:rPr>
+          <w:rFonts w:ascii="Arial" w:hAnsi="Arial" w:cs="Arial"/>
+          <w:sz w:val="24"/>
+          <w:szCs w:val="24"/>
+        </w:rPr>
+        <w:t xml:space="preserve"> 2026)</w:t>
+      </w:r>
     </w:p>
     <w:p>
       <w:pPr>
@@ -11166,7 +11632,7 @@
     </w:p>
     <w:sectPr>
       <w:pgSz w:w="11906" w:h="16838"/>
-      <w:pgMar w:top="1417" w:right="1417" w:bottom="1134" w:left="1417" w:header="708" w:footer="708" w:gutter="0"/>
+      <w:pgMar w:top="1418" w:right="1418" w:bottom="1418" w:left="1418" w:header="709" w:footer="709" w:gutter="0"/>
       <w:cols w:space="708"/>
       <w:docGrid w:linePitch="360"/>
     </w:sectPr>

</xml_diff>